<commit_message>
ca3 answering, opening and reply briefs: docx/make-reference.sh and reference.docx give way to docx/reference.xml (base="xengine" plus Body Text Noted); .docx.pdf byte-identical, .docx differs only in where the added style sits; check.sh typst, latex, docx 0 failed, XENG-001..003 pass (fb-595.68.5)
</commit_message>
<xml_diff>
--- a/courts/third-circuit/court-of-appeals/answering-brief/usage/OUTPUT-answering-brief.docx
+++ b/courts/third-circuit/court-of-appeals/answering-brief/usage/OUTPUT-answering-brief.docx
@@ -8219,14 +8219,6 @@
       <w:ind w:left="720" w:hanging="720"/>
     </w:pPr>
   </w:style>
-  <w:style w:type="paragraph" w:customStyle="1" w:styleId="BodyTextNoted">
-    <w:name w:val="Body Text Noted"/>
-    <w:basedOn w:val="BodyText"/>
-    <w:qFormat/>
-    <w:pPr>
-      <w:widowControl w:val="0"/>
-    </w:pPr>
-  </w:style>
   <w:style w:type="paragraph" w:styleId="BlockText">
     <w:name w:val="Block Text"/>
     <w:basedOn w:val="BodyText"/>
@@ -8392,6 +8384,14 @@
       <w:bCs w:val="0"/>
       <w:color w:val="365F91" w:themeColor="accent1" w:themeShade="BF"/>
     </w:rPr>
+  </w:style>
+  <w:style w:type="paragraph" w:customStyle="1" w:styleId="BodyTextNoted">
+    <w:name w:val="Body Text Noted"/>
+    <w:basedOn w:val="BodyText"/>
+    <w:qFormat/>
+    <w:pPr>
+      <w:widowControl w:val="0"/>
+    </w:pPr>
   </w:style>
   <w:style w:type="paragraph" w:customStyle="1" w:styleId="SourceCode">
     <w:name w:val="Source Code"/>

</xml_diff>